<commit_message>
Prepare secure test infrastructure, Allure reporting and thesis documentation
</commit_message>
<xml_diff>
--- a/docs/test-documentation/Test_Plan_updated.docx
+++ b/docs/test-documentation/Test_Plan_updated.docx
@@ -20,12 +20,12 @@
     </w:p>
     <w:p>
       <w:r>
-        <w:t>Проект: Task Manager · Версия: 0.2 (уточнённый проект) · Дата: 19.10.2026</w:t>
+        <w:t>Проект: Task Manager · Версия: 1.1 · Подтверждённые прогоны: 27.10.2026</w:t>
       </w:r>
     </w:p>
     <w:p>
       <w:r>
-        <w:t>Статус: проект документа. Подтверждены маршруты регистрации, CSRF и удаления аккаунта; остальные контракты и UI-локаторы уточняются после сверки с реализацией.</w:t>
+        <w:t>Статус: актуальный объём автоматизации сопоставлен с Java-тестами, DataProvider и сохранёнными результатами. Первоначальные нереализованные сценарии отделены от действующего реестра.</w:t>
       </w:r>
     </w:p>
     <w:p>
@@ -38,7 +38,7 @@
     </w:p>
     <w:p>
       <w:r>
-        <w:t>Цель — спроектировать и реализовать воспроизводимые автоматизированные процедуры для проверки веб-приложения Task Manager. Объект тестирования: Spring Boot веб-приложение с UI, REST API, регистрацией, авторизацией и операциями над задачами. Публичная среда: https://task-manager-kqoi.onrender.com. Для изменяющих данные сценариев предпочтительна отдельная тестовая среда/БД.</w:t>
+        <w:t>Цель — воспроизводимая проверка регистрации, авторизации и операций с задачами в отдельной тестовой среде https://task-manager-test-588r.onrender.com. Используется PostgreSQL task_manager_test на подтверждённом тестовом hostname и порту. Production исключён из конфигурации запусков.</w:t>
       </w:r>
     </w:p>
     <w:p>
@@ -51,7 +51,7 @@
     </w:p>
     <w:p>
       <w:r>
-        <w:t>В области тестирования: регистрация и валидация; вход, выход и сессии; создание, просмотр, редактирование, удаление задач; статусы, приоритеты, сроки; изоляция данных пользователей; CSRF; корректность HTTP-статусов и JSON. Вне области первоначального этапа: нагрузочные испытания, мобильные платформы, внешние интеграции, полный аудит безопасности.</w:t>
+        <w:t>Реализованы регистрация и API/HTML-валидация, вход, API-выход, список и CRUD задач, API-изоляция пользователей, JSON Schema и JDBC-проверки. Получение CSRF является служебным шагом клиентов и не считается самостоятельным тестом защиты без токена. Актуальный реестр содержит только реализованные сценарии.</w:t>
       </w:r>
     </w:p>
     <w:p>
@@ -64,7 +64,7 @@
     </w:p>
     <w:p>
       <w:r>
-        <w:t>40 запланированных сценариев: 20 UI и 20 API. UI — Selenium WebDriver + TestNG, Page Object и явные ожидания. API — REST Assured + TestNG; изолированные HTTP-сессии, cookies и CSRF-токен одной сессии. Позитивные, негативные, граничные и проверки прав доступа. Проверять HTTP-код, формат тела ответа (JSON либо текст), состояние данных; неподтверждённые статусы уточнять по контроллерам и обработчикам ошибок.</w:t>
+        <w:t>Самостоятельных логических кейсов — 66: 34 API и 32 UI. Они реализованы 56 Java-методами: 27 API и 29 UI. В 23 DataProvider описаны 84 параметризованных выполнения; ещё 33 вызова не имеют параметров. Regression подтверждает 51 API и 66 UI выполнений, всего 117. Smoke — 6 API и 4 UI, подмножество Regression. Кейс может объединять однотипные строки DataProvider; количество кейсов, методов и выполнений — разные показатели.</w:t>
       </w:r>
     </w:p>
     <w:p>
@@ -77,7 +77,7 @@
     </w:p>
     <w:p>
       <w:r>
-        <w:t>Test_Matrix.xlsx — соответствие требований REQ-01…REQ-09 и кейсов; Test_Cases.xlsx — 40 кейсов UI-001…UI-020 и API-001…API-020; Test_Data.xlsx — фикстуры TD-* и правила генерации. Ссылки на ID сохраняются согласованными. Фактические статусы ответов, не подтверждённые кодом, помечены для уточнения.</w:t>
+        <w:t>Test_Cases_extended.xlsx: «Тест-кейсы» — 66 актуальных сценариев; «Связанные проверки» — 4 проверки внутри родительских сценариев с сохранёнными ID, без дополнительного счёта запусков; «Первоначальный план» — 14 исторических кейсов вне действующего объёма; «Сводка» — правила подсчёта. Для каждого актуального кейса указаны Java-класс, метод, данные/строки DataProvider, ожидаемый результат и подтверждение PASS.</w:t>
       </w:r>
     </w:p>
     <w:p>
@@ -90,7 +90,7 @@
     </w:p>
     <w:p>
       <w:r>
-        <w:t>Родительский Maven pom.xml с packaging=pom и модулями ui-tests и api-tests. Java 17, TestNG, Selenium WebDriver, REST Assured, Allure, GitHub Actions. UI использует Page Object; API — clients, DTO и генераторы тестовых данных. Секреты — только из переменных окружения. Для API используются session cookies, CSRF и авторизация Spring Security formLogin.</w:t>
+        <w:t>Родительский Maven POM и модули api-tests / ui-tests; Java 17, TestNG 7.10.2, Selenium 4.27.0, REST Assured 5.5.0, PostgreSQL JDBC, Allure TestNG 2.29.1. Шаги в Page Object и API-клиентах; AspectJ 1.9.22.1 обеспечивает @Step. HTTP-вложения содержат только метод, разрешённый путь, статус и длительность.</w:t>
       </w:r>
     </w:p>
     <w:p>
@@ -102,8 +102,11 @@
       </w:r>
     </w:p>
     <w:p>
+      <w:pPr>
+        <w:keepLines/>
+      </w:pPr>
       <w:r>
-        <w:t>Локальная среда и Render; Chrome, Java 17, Maven, PostgreSQL. Для тестов регистрации создавать уникальных временных пользователей; после проверки авторизоваться и удалить через DELETE /api/users/me (ожидается 204). Для CRUD использовать выделенный тестовый аккаунт и независимые задачи, удаляемые после каждого теста. Очистка best effort: сбой сети может оставить данные; предпочтительна отдельная БД. Render Free может засыпать; холодный старт сам по себе не дефект.</w:t>
+        <w:t>Секреты сохраняются однократно scripts/Initialize-TestSecrets.ps1 вне Git через Windows DPAPI и ACL. Запуск: scripts/Invoke-TestMaven.ps1 с именем набора или метода. TLS require / verify-full сохраняется как введён. Очищаются только данные, зарегистрированные существующим JDBC teardown.</w:t>
       </w:r>
     </w:p>
     <w:p>
@@ -116,7 +119,7 @@
     </w:p>
     <w:p>
       <w:r>
-        <w:t>Приложение доступно; выделенный тестовый аккаунт готов; API-контракт проверен по коду и Swagger; UI-локаторы определены; сценарии и тестовые данные согласованы; доступен GET /api/csrf (после развёртывания разрешения в SecurityConfig); подтверждена схема formLogin.</w:t>
+        <w:t>Нужны Java 17, Maven, Chrome, доступ к тестовому Render и PostgreSQL, постоянный тестовый пользователь и четыре секрета. UI ожидает готовность Render до четырёх минут; CI выполняет аналогичный прогрев для каждого набора. Рабочее локальное подключение проверено без изменения серверных настроек PostgreSQL.</w:t>
       </w:r>
     </w:p>
     <w:p>
@@ -129,7 +132,7 @@
     </w:p>
     <w:p>
       <w:r>
-        <w:t>Все утверждённые кейсы автоматизированы либо имеют обоснованное исключение; тесты воспроизводимы и независимы; отчёт Allure формируется; выявленные дефекты и ограничения зафиксированы; есть результаты локального и CI-запуска. Процент успешности не задаётся заранее и определяется фактическим прогоном.</w:t>
+        <w:t>Критерий завершения: каждый актуальный кейс связан с реализованным методом и подтверждённой записью запуска. 66 основных кейсов распределяют все 117 выполнений Regression без повторного счёта; связанные проверки не добавляют вызовов. Исторический план не влияет на текущие статусы и показатели. Ошибок teardown нет; удалённый CI остаётся неподтверждённым до запуска в GitHub.</w:t>
       </w:r>
     </w:p>
     <w:p>
@@ -142,7 +145,7 @@
     </w:p>
     <w:p>
       <w:r>
-        <w:t>Риски: холодный старт Render, общая БД, оставшиеся данные при неудачном teardown, конфликт параллельных прогонов, изменение DTO/HTML, особенности formLogin и CSRF. Меры: отдельная тестовая БД по возможности, UUID для временных данных, отдельные сессии и CSRF, @AfterMethod(alwaysRun = true), проверка очистки, повторная диагностика сбоев.</w:t>
+        <w:t>DPAPI доступен процессам того же пользователя Windows. Общая тестовая БД исключает параллельные запуски. CI использует max-parallel=1 и общую concurrency group без отмены текущего запуска. Холодный старт Render и ограничения сети могут увеличивать время. Selenium предупреждает о несовпадении CDP с Chrome 156; текущие WebDriver-сценарии проходят и CDP не используют. Прямой запуск Maven в обход скрипта не получает его защиты вывода.</w:t>
       </w:r>
     </w:p>
     <w:p>
@@ -155,7 +158,7 @@
     </w:p>
     <w:p>
       <w:r>
-        <w:t>Allure: пройденные/упавшие/пропущенные тесты, длительность, вложения и скриншоты UI при ошибках. Показатели ВКР: доля автоматизированных кейсов, длительность прогонов, стабильность повторных запусков, выявленные дефекты. Сравнение с ручным выполнением возможно после замеров, без выдуманных значений.</w:t>
+        <w:t>Источник фактических статусов — сохранённые Allure JSON от 27.10.2026: API Smoke 6 PASS; API Regression 51 PASS; UI Smoke 4 PASS; UI Regression 66 PASS. Новые запуски ради правки документов не выполнялись. Номера вариантов DataProvider сопоставлены с порядком строк исходного кода. Все 84 варианта описаны отдельно в Test Data с ожидаемыми результатами и UUID подтверждения.</w:t>
       </w:r>
     </w:p>
     <w:p>
@@ -163,12 +166,12 @@
         <w:pStyle w:val="Heading1"/>
       </w:pPr>
       <w:r>
-        <w:t>11. План иллюстраций для ВКР</w:t>
+        <w:t>11. Данные и матрица трассировки</w:t>
       </w:r>
     </w:p>
     <w:p>
       <w:r>
-        <w:t>Архитектура многомодульного Maven-проекта; схема тестовой среды и CI; последовательность авторизации и CSRF; Page Object и поток выполнения UI-теста; взаимодействие REST Assured с API; фрагмент матрицы покрытия; фрагмент тест-кейса; скриншоты Allure; диаграмма результатов прогонов.</w:t>
+        <w:t>Test_Data_updated.xlsx содержит используемые фикстуры, 23 набора и отдельный лист «DataProvider» с 84 строками без значений паролей. Неиспользуемые данные перенесены в историю. Test_Matrix_updated.xlsx ссылается только на актуальные кейсы и показывает отдельно число кейсов, методов и выполнений. REQ-08/REQ-09 из первоначального плана оставлены в истории; REQ-10 описывает фактическую JDBC-проверку.</w:t>
       </w:r>
     </w:p>
     <w:p>
@@ -176,17 +179,17 @@
         <w:pStyle w:val="Heading1"/>
       </w:pPr>
       <w:r>
-        <w:t>12. Порядок работ</w:t>
+        <w:t>12. Воспроизведение результатов</w:t>
       </w:r>
     </w:p>
     <w:p>
       <w:r>
-        <w:t>1) Сверить тестовую матрицу с функциональностью Task Manager. 2) Уточнить кейсы и данные. 3) Создать Maven-модули. 4) Реализовать базовые фикстуры и тесты. 5) Настроить Allure и GitHub Actions. 6) Выполнить прогоны и измерения. 7) Обновить документы и материалы ВКР.</w:t>
+        <w:t>Отчёты Smoke и Regression формируются отдельно scripts/Get-AllureReport.ps1. Подтверждения хранятся в target/runs/&lt;Suite&gt;/allure-results; не суммировать повторные архивные прогоны. GitHub workflow .github/workflows/tests.yml подготовлен для environment test и GitHub Secrets, но не опубликован и не запускался. Все значения секретов исключены из документации; настройки окружения описаны в workflow.</w:t>
       </w:r>
     </w:p>
     <w:p>
       <w:r>
-        <w:t>Примечание: тест-план является проектной документацией для ВКР и подлежит согласованию с руководителем.</w:t>
+        <w:t>Тесты, DataProvider и очистка ради документации не изменялись. Сохранены ID реализованных сценариев; новые ID назначены только фактически существующим вариантам. Основной проект и production не изменялись. Commit, push и merge не выполнялись.</w:t>
       </w:r>
     </w:p>
     <w:sectPr>
@@ -563,7 +566,7 @@
     <w:qFormat/>
     <w:rsid w:val="00FC693F"/>
     <w:pPr>
-      <w:spacing w:after="120"/>
+      <w:spacing w:after="80"/>
     </w:pPr>
     <w:rPr>
       <w:rFonts w:ascii="Arial" w:hAnsi="Arial"/>
@@ -625,7 +628,7 @@
     <w:pPr>
       <w:keepNext/>
       <w:keepLines/>
-      <w:spacing w:before="480" w:after="0"/>
+      <w:spacing w:before="320" w:after="0"/>
       <w:outlineLvl w:val="0"/>
     </w:pPr>
     <w:rPr>

</xml_diff>